<commit_message>
docs: menambahkan kuis pertemuan 11
</commit_message>
<xml_diff>
--- a/kuis pertemuan 11.docx
+++ b/kuis pertemuan 11.docx
@@ -239,13 +239,7 @@
         <w:rPr>
           <w:rFonts w:ascii="Times New Roman" w:hAnsi="Times New Roman" w:cs="Times New Roman"/>
         </w:rPr>
-        <w:t xml:space="preserve"> </w:t>
-      </w:r>
-      <w:r>
-        <w:rPr>
-          <w:rFonts w:ascii="Times New Roman" w:hAnsi="Times New Roman" w:cs="Times New Roman"/>
-        </w:rPr>
-        <w:t xml:space="preserve">List </w:t>
+        <w:t xml:space="preserve"> List </w:t>
       </w:r>
       <w:proofErr w:type="spellStart"/>
       <w:r>
@@ -421,13 +415,7 @@
         <w:rPr>
           <w:rFonts w:ascii="Times New Roman" w:hAnsi="Times New Roman" w:cs="Times New Roman"/>
         </w:rPr>
-        <w:t xml:space="preserve"> </w:t>
-      </w:r>
-      <w:r>
-        <w:rPr>
-          <w:rFonts w:ascii="Times New Roman" w:hAnsi="Times New Roman" w:cs="Times New Roman"/>
-        </w:rPr>
-        <w:t xml:space="preserve">Key </w:t>
+        <w:t xml:space="preserve"> Key </w:t>
       </w:r>
       <w:proofErr w:type="spellStart"/>
       <w:r>
@@ -673,13 +661,7 @@
         <w:rPr>
           <w:rFonts w:ascii="Times New Roman" w:hAnsi="Times New Roman" w:cs="Times New Roman"/>
         </w:rPr>
-        <w:t xml:space="preserve"> </w:t>
-      </w:r>
-      <w:r>
-        <w:rPr>
-          <w:rFonts w:ascii="Times New Roman" w:hAnsi="Times New Roman" w:cs="Times New Roman"/>
-        </w:rPr>
-        <w:t xml:space="preserve">Python </w:t>
+        <w:t xml:space="preserve"> Python </w:t>
       </w:r>
       <w:proofErr w:type="spellStart"/>
       <w:r>
@@ -841,13 +823,7 @@
         <w:rPr>
           <w:rFonts w:ascii="Times New Roman" w:hAnsi="Times New Roman" w:cs="Times New Roman"/>
         </w:rPr>
-        <w:t xml:space="preserve"> </w:t>
-      </w:r>
-      <w:r>
-        <w:rPr>
-          <w:rFonts w:ascii="Times New Roman" w:hAnsi="Times New Roman" w:cs="Times New Roman"/>
-        </w:rPr>
-        <w:t>data['</w:t>
+        <w:t xml:space="preserve"> data['</w:t>
       </w:r>
       <w:proofErr w:type="spellStart"/>
       <w:r>
@@ -1687,19 +1663,7 @@
         <w:rPr>
           <w:rFonts w:ascii="Times New Roman" w:hAnsi="Times New Roman" w:cs="Times New Roman"/>
         </w:rPr>
-        <w:t>"] =</w:t>
-      </w:r>
-      <w:r>
-        <w:rPr>
-          <w:rFonts w:ascii="Times New Roman" w:hAnsi="Times New Roman" w:cs="Times New Roman"/>
-        </w:rPr>
-        <w:t xml:space="preserve"> </w:t>
-      </w:r>
-      <w:r>
-        <w:rPr>
-          <w:rFonts w:ascii="Times New Roman" w:hAnsi="Times New Roman" w:cs="Times New Roman"/>
-        </w:rPr>
-        <w:t>90.</w:t>
+        <w:t>"] = 90.</w:t>
       </w:r>
     </w:p>
     <w:p>
@@ -1819,13 +1783,7 @@
         <w:rPr>
           <w:rFonts w:ascii="Times New Roman" w:hAnsi="Times New Roman" w:cs="Times New Roman"/>
         </w:rPr>
-        <w:t xml:space="preserve"> </w:t>
-      </w:r>
-      <w:r>
-        <w:rPr>
-          <w:rFonts w:ascii="Times New Roman" w:hAnsi="Times New Roman" w:cs="Times New Roman"/>
-        </w:rPr>
-        <w:t xml:space="preserve">Karena NIM </w:t>
+        <w:t xml:space="preserve"> Karena NIM </w:t>
       </w:r>
       <w:proofErr w:type="spellStart"/>
       <w:r>
@@ -2095,6 +2053,87 @@
         </w:rPr>
         <w:t xml:space="preserve"> git push.</w:t>
       </w:r>
+    </w:p>
+    <w:p>
+      <w:pPr>
+        <w:pStyle w:val="ListParagraph"/>
+        <w:rPr>
+          <w:rFonts w:ascii="Times New Roman" w:hAnsi="Times New Roman" w:cs="Times New Roman"/>
+        </w:rPr>
+      </w:pPr>
+    </w:p>
+    <w:p>
+      <w:pPr>
+        <w:pStyle w:val="ListParagraph"/>
+        <w:rPr>
+          <w:rFonts w:ascii="Times New Roman" w:hAnsi="Times New Roman" w:cs="Times New Roman"/>
+        </w:rPr>
+      </w:pPr>
+      <w:r>
+        <w:rPr>
+          <w:rFonts w:ascii="Times New Roman" w:hAnsi="Times New Roman" w:cs="Times New Roman"/>
+        </w:rPr>
+        <w:t xml:space="preserve">Link </w:t>
+      </w:r>
+      <w:proofErr w:type="spellStart"/>
+      <w:r>
+        <w:rPr>
+          <w:rFonts w:ascii="Times New Roman" w:hAnsi="Times New Roman" w:cs="Times New Roman"/>
+        </w:rPr>
+        <w:t>Github</w:t>
+      </w:r>
+      <w:proofErr w:type="spellEnd"/>
+      <w:r>
+        <w:rPr>
+          <w:rFonts w:ascii="Times New Roman" w:hAnsi="Times New Roman" w:cs="Times New Roman"/>
+        </w:rPr>
+        <w:t xml:space="preserve"> </w:t>
+      </w:r>
+      <w:proofErr w:type="spellStart"/>
+      <w:r>
+        <w:rPr>
+          <w:rFonts w:ascii="Times New Roman" w:hAnsi="Times New Roman" w:cs="Times New Roman"/>
+        </w:rPr>
+        <w:t>pertemuan</w:t>
+      </w:r>
+      <w:proofErr w:type="spellEnd"/>
+      <w:r>
+        <w:rPr>
+          <w:rFonts w:ascii="Times New Roman" w:hAnsi="Times New Roman" w:cs="Times New Roman"/>
+        </w:rPr>
+        <w:t xml:space="preserve"> </w:t>
+      </w:r>
+      <w:proofErr w:type="gramStart"/>
+      <w:r>
+        <w:rPr>
+          <w:rFonts w:ascii="Times New Roman" w:hAnsi="Times New Roman" w:cs="Times New Roman"/>
+        </w:rPr>
+        <w:t>11  :</w:t>
+      </w:r>
+      <w:proofErr w:type="gramEnd"/>
+      <w:r>
+        <w:rPr>
+          <w:rFonts w:ascii="Times New Roman" w:hAnsi="Times New Roman" w:cs="Times New Roman"/>
+        </w:rPr>
+        <w:t xml:space="preserve"> </w:t>
+      </w:r>
+      <w:hyperlink r:id="rId5" w:history="1">
+        <w:r>
+          <w:rPr>
+            <w:rStyle w:val="Hyperlink"/>
+            <w:rFonts w:ascii="Times New Roman" w:hAnsi="Times New Roman" w:cs="Times New Roman"/>
+          </w:rPr>
+          <w:t>https://github.com/maulianamutiara/pertemuan-11-dictionary-2225250078</w:t>
+        </w:r>
+      </w:hyperlink>
+    </w:p>
+    <w:p>
+      <w:pPr>
+        <w:pStyle w:val="ListParagraph"/>
+        <w:rPr>
+          <w:rFonts w:ascii="Times New Roman" w:hAnsi="Times New Roman" w:cs="Times New Roman"/>
+        </w:rPr>
+      </w:pPr>
     </w:p>
     <w:sectPr>
       <w:pgSz w:w="12240" w:h="15840"/>
@@ -2806,6 +2845,7 @@
   <w:style w:type="character" w:default="1" w:styleId="DefaultParagraphFont">
     <w:name w:val="Default Paragraph Font"/>
     <w:uiPriority w:val="1"/>
+    <w:semiHidden/>
     <w:unhideWhenUsed/>
   </w:style>
   <w:style w:type="table" w:default="1" w:styleId="TableNormal">
@@ -3128,6 +3168,29 @@
     <w:rsid w:val="00D26E4F"/>
     <w:rPr>
       <w:rFonts w:ascii="Times New Roman" w:hAnsi="Times New Roman" w:cs="Times New Roman"/>
+    </w:rPr>
+  </w:style>
+  <w:style w:type="character" w:styleId="Hyperlink">
+    <w:name w:val="Hyperlink"/>
+    <w:basedOn w:val="DefaultParagraphFont"/>
+    <w:uiPriority w:val="99"/>
+    <w:unhideWhenUsed/>
+    <w:rsid w:val="00CB48D5"/>
+    <w:rPr>
+      <w:color w:val="0563C1" w:themeColor="hyperlink"/>
+      <w:u w:val="single"/>
+    </w:rPr>
+  </w:style>
+  <w:style w:type="character" w:styleId="UnresolvedMention">
+    <w:name w:val="Unresolved Mention"/>
+    <w:basedOn w:val="DefaultParagraphFont"/>
+    <w:uiPriority w:val="99"/>
+    <w:semiHidden/>
+    <w:unhideWhenUsed/>
+    <w:rsid w:val="00CB48D5"/>
+    <w:rPr>
+      <w:color w:val="605E5C"/>
+      <w:shd w:val="clear" w:color="auto" w:fill="E1DFDD"/>
     </w:rPr>
   </w:style>
 </w:styles>

</xml_diff>